<commit_message>
Auto sync: Dữ liệu Cập nhật Phân tích & Giao diện (H1) mới
</commit_message>
<xml_diff>
--- a/Daily Reports/01_09_2026-CBOT Reports.docx
+++ b/Daily Reports/01_09_2026-CBOT Reports.docx
@@ -104,7 +104,7 @@
           <w:color w:val="5C768D"/>
           <w:sz w:val="19"/>
         </w:rPr>
-        <w:t>Cập nhật tự động qua `macro_tracker.py` vào lúc 13:44 ICT ngày 01/09/2026</w:t>
+        <w:t>Cập nhật tự động qua `macro_tracker.py` vào lúc 14:10 ICT ngày 01/09/2026</w:t>
       </w:r>
     </w:p>
     <w:tbl>
@@ -313,7 +313,7 @@
               <w:rPr>
                 <w:b/>
               </w:rPr>
-              <w:t>88.67 / thùng</w:t>
+              <w:t>88.84 / thùng</w:t>
             </w:r>
           </w:p>
         </w:tc>
@@ -344,7 +344,7 @@
               <w:rPr>
                 <w:b/>
               </w:rPr>
-              <w:t>-2.01%</w:t>
+              <w:t>-1.82%</w:t>
             </w:r>
           </w:p>
         </w:tc>
@@ -442,7 +442,7 @@
               <w:rPr>
                 <w:b/>
               </w:rPr>
-              <w:t>99.54</w:t>
+              <w:t>99.52</w:t>
             </w:r>
           </w:p>
         </w:tc>
@@ -473,7 +473,7 @@
               <w:rPr>
                 <w:b/>
               </w:rPr>
-              <w:t>+0.11%</w:t>
+              <w:t>+0.09%</w:t>
             </w:r>
           </w:p>
         </w:tc>
@@ -1228,7 +1228,7 @@
         <w:rPr>
           <w:b/>
         </w:rPr>
-        <w:t>`88.67` (-2.01%)</w:t>
+        <w:t>`88.84` (-1.82%)</w:t>
       </w:r>
       <w:r>
         <w:t xml:space="preserve"> | DXY: </w:t>
@@ -1237,7 +1237,7 @@
         <w:rPr>
           <w:b/>
         </w:rPr>
-        <w:t>`99.54` (+0.11%)</w:t>
+        <w:t>`99.52` (+0.09%)</w:t>
       </w:r>
       <w:r>
         <w:t xml:space="preserve"> | Lúa mì CBOT: </w:t>
@@ -1246,7 +1246,7 @@
         <w:rPr>
           <w:b/>
         </w:rPr>
-        <w:t>`773.25` (+2.18%)</w:t>
+        <w:t>`779.25` (+3.01%)</w:t>
       </w:r>
       <w:r>
         <w:t>.</w:t>
@@ -1316,7 +1316,7 @@
           <w:color w:val="5C768D"/>
           <w:sz w:val="19"/>
         </w:rPr>
-        <w:t>Cập nhật tự động lúc 13:44 ICT ngày 01/09/2026 — Nguồn: NOAA, USDA, BOM Australia</w:t>
+        <w:t>Cập nhật tự động lúc 14:10 ICT ngày 01/09/2026 — Nguồn: NOAA, USDA, BOM Australia</w:t>
       </w:r>
     </w:p>
     <w:p>
@@ -3584,7 +3584,7 @@
               <w:rPr>
                 <w:b/>
               </w:rPr>
-              <w:t>537.25</w:t>
+              <w:t>539.00</w:t>
             </w:r>
           </w:p>
         </w:tc>
@@ -3615,7 +3615,7 @@
               <w:rPr>
                 <w:b/>
               </w:rPr>
-              <w:t>538.51 (+1.26)</w:t>
+              <w:t>540.22 (+1.22)</w:t>
             </w:r>
           </w:p>
         </w:tc>
@@ -3643,7 +3643,7 @@
             </w:pPr>
             <w:r/>
             <w:r>
-              <w:t>Bullish (536.90 &gt; 535.59)</w:t>
+              <w:t>Bullish (537.22 &gt; 535.78)</w:t>
             </w:r>
           </w:p>
         </w:tc>
@@ -3671,7 +3671,7 @@
             </w:pPr>
             <w:r/>
             <w:r>
-              <w:t>1.50 cents</w:t>
+              <w:t>0.25 cents</w:t>
             </w:r>
           </w:p>
         </w:tc>
@@ -3832,7 +3832,7 @@
               <w:rPr>
                 <w:b/>
               </w:rPr>
-              <w:t>773.25</w:t>
+              <w:t>779.25</w:t>
             </w:r>
           </w:p>
         </w:tc>
@@ -3863,7 +3863,7 @@
               <w:rPr>
                 <w:b/>
               </w:rPr>
-              <w:t>777.81 (+4.56)</w:t>
+              <w:t>783.89 (+4.64)</w:t>
             </w:r>
           </w:p>
         </w:tc>
@@ -3891,7 +3891,7 @@
             </w:pPr>
             <w:r/>
             <w:r>
-              <w:t>Bullish (771.15 &gt; 765.46)</w:t>
+              <w:t>Bullish (772.36 &gt; 766.22)</w:t>
             </w:r>
           </w:p>
         </w:tc>
@@ -3919,7 +3919,7 @@
             </w:pPr>
             <w:r/>
             <w:r>
-              <w:t>2.50 cents</w:t>
+              <w:t>1.25 cents</w:t>
             </w:r>
           </w:p>
         </w:tc>
@@ -4357,7 +4357,7 @@
                 <w:b/>
                 <w:color w:val="15803D"/>
               </w:rPr>
-              <w:t>535.00 - 536.90 cents (Canh mua vùng hỗ trợ)</w:t>
+              <w:t>536.25 - 537.22 cents (Canh mua vùng hỗ trợ)</w:t>
             </w:r>
           </w:p>
         </w:tc>
@@ -4388,7 +4388,7 @@
               <w:rPr>
                 <w:b/>
               </w:rPr>
-              <w:t>453.13 cents (Dưới cản S2 + 1.5x ATR)</w:t>
+              <w:t>453.50 cents (Dưới cản S2 + 1.5x ATR)</w:t>
             </w:r>
           </w:p>
         </w:tc>
@@ -4424,7 +4424,7 @@
                 <w:color w:val="D97706"/>
                 <w:sz w:val="19"/>
               </w:rPr>
-              <w:t xml:space="preserve"> 538.75 cents </w:t>
+              <w:t xml:space="preserve"> 540.50 cents </w:t>
             </w:r>
             <w:r>
               <w:t xml:space="preserve"> / TP2: </w:t>
@@ -4569,7 +4569,7 @@
               <w:rPr>
                 <w:b/>
               </w:rPr>
-              <w:t>533.50 - 535.00 cents</w:t>
+              <w:t>534.75 - 536.25 cents</w:t>
             </w:r>
           </w:p>
         </w:tc>
@@ -4600,7 +4600,7 @@
               <w:rPr>
                 <w:b/>
               </w:rPr>
-              <w:t>454.50 cents (Chống quét SL tuyệt đối)</w:t>
+              <w:t>454.75 cents (Chống quét SL tuyệt đối)</w:t>
             </w:r>
           </w:p>
         </w:tc>
@@ -4762,7 +4762,7 @@
               <w:rPr>
                 <w:b/>
               </w:rPr>
-              <w:t>538.75 - 540.25 cents</w:t>
+              <w:t>540.50 - 542.00 cents</w:t>
             </w:r>
           </w:p>
         </w:tc>
@@ -4793,7 +4793,7 @@
               <w:rPr>
                 <w:b/>
               </w:rPr>
-              <w:t>541.50 cents</w:t>
+              <w:t>543.00 cents</w:t>
             </w:r>
           </w:p>
         </w:tc>
@@ -4955,7 +4955,7 @@
               <w:rPr>
                 <w:b/>
               </w:rPr>
-              <w:t>446.27 - 457.25 cents</w:t>
+              <w:t>447.25 - 457.25 cents</w:t>
             </w:r>
           </w:p>
         </w:tc>
@@ -5136,7 +5136,7 @@
                 <w:b/>
                 <w:color w:val="B91C1C"/>
               </w:rPr>
-              <w:t>771.15 - 765.46 cents (Canh bán hồi kỹ thuật H1)</w:t>
+              <w:t>772.36 - 766.22 cents (Canh bán hồi kỹ thuật H1)</w:t>
             </w:r>
           </w:p>
         </w:tc>
@@ -5167,7 +5167,7 @@
               <w:rPr>
                 <w:b/>
               </w:rPr>
-              <w:t>799.70 cents (Trên kháng cự R2 + 1.5x ATR)</w:t>
+              <w:t>799.60 cents (Trên kháng cự R2 + 1.5x ATR)</w:t>
             </w:r>
           </w:p>
         </w:tc>
@@ -5203,7 +5203,7 @@
                 <w:color w:val="D97706"/>
                 <w:sz w:val="19"/>
               </w:rPr>
-              <w:t xml:space="preserve"> 770.00 cents </w:t>
+              <w:t xml:space="preserve"> 774.25 cents </w:t>
             </w:r>
             <w:r>
               <w:t xml:space="preserve"> / TP2: </w:t>
@@ -5345,7 +5345,7 @@
               <w:rPr>
                 <w:b/>
               </w:rPr>
-              <w:t>768.00 - 770.00 cents</w:t>
+              <w:t>772.25 - 774.25 cents</w:t>
             </w:r>
           </w:p>
         </w:tc>
@@ -5376,7 +5376,7 @@
               <w:rPr>
                 <w:b/>
               </w:rPr>
-              <w:t>638.95 cents</w:t>
+              <w:t>639.01 cents</w:t>
             </w:r>
           </w:p>
         </w:tc>
@@ -5407,7 +5407,7 @@
               <w:rPr>
                 <w:b/>
               </w:rPr>
-              <w:t>780.00 cents (Đón sóng hồi trung hạn ~14.5 giá)</w:t>
+              <w:t>782.75 cents (Đón sóng hồi trung hạn ~14.5 giá)</w:t>
             </w:r>
           </w:p>
         </w:tc>
@@ -5538,7 +5538,7 @@
               <w:rPr>
                 <w:b/>
               </w:rPr>
-              <w:t>780.00 - 782.00 cents</w:t>
+              <w:t>782.75 - 784.75 cents</w:t>
             </w:r>
           </w:p>
         </w:tc>
@@ -5569,7 +5569,7 @@
               <w:rPr>
                 <w:b/>
               </w:rPr>
-              <w:t>786.30 cents</w:t>
+              <w:t>788.99 cents</w:t>
             </w:r>
           </w:p>
         </w:tc>
@@ -5731,7 +5731,7 @@
               <w:rPr>
                 <w:b/>
               </w:rPr>
-              <w:t>620.04 - 645.25 cents</w:t>
+              <w:t>620.31 - 645.25 cents</w:t>
             </w:r>
           </w:p>
         </w:tc>
@@ -11609,7 +11609,7 @@
         <w:t>Giá Chốt Phiên (Close):</w:t>
       </w:r>
       <w:r>
-        <w:t xml:space="preserve"> 537.25 cents | </w:t>
+        <w:t xml:space="preserve"> 539.00 cents | </w:t>
       </w:r>
       <w:r>
         <w:rPr>
@@ -11624,10 +11624,10 @@
         <w:rPr>
           <w:b/>
         </w:rPr>
-        <w:t>`538.51 cents`</w:t>
+        <w:t>`540.22 cents`</w:t>
       </w:r>
       <w:r>
-        <w:t xml:space="preserve"> (+1.26).</w:t>
+        <w:t xml:space="preserve"> (+1.22).</w:t>
       </w:r>
     </w:p>
     <w:p>
@@ -11648,7 +11648,7 @@
         <w:rPr>
           <w:b/>
         </w:rPr>
-        <w:t>`17,967`</w:t>
+        <w:t>`19,736`</w:t>
       </w:r>
       <w:r>
         <w:t xml:space="preserve"> (Chênh lệch: </w:t>
@@ -11657,7 +11657,7 @@
         <w:rPr>
           <w:b/>
         </w:rPr>
-        <w:t>`-418,509`</w:t>
+        <w:t>`-416,740`</w:t>
       </w:r>
       <w:r>
         <w:t xml:space="preserve">) | OI: </w:t>
@@ -11699,7 +11699,7 @@
         <w:rPr>
           <w:b/>
         </w:rPr>
-        <w:t>`Không phát hiện mô hình nến đặc biệt`</w:t>
+        <w:t>`Bullish Marubozu (Lực mua áp đảo tuyệt đối)`</w:t>
       </w:r>
     </w:p>
     <w:p>
@@ -11719,9 +11719,9 @@
       <w:r>
         <w:rPr>
           <w:b/>
-          <w:color w:val="15803D"/>
+          <w:color w:val="B91C1C"/>
         </w:rPr>
-        <w:t>`Giảm suy yếu / Đáy ngắn hạn (Long Liquidation Decline)`</w:t>
+        <w:t>`Tăng yếu / Rủi ro đảo chiều (Short Covering Rally)`</w:t>
       </w:r>
     </w:p>
     <w:p>
@@ -11742,10 +11742,10 @@
         <w:rPr>
           <w:b/>
         </w:rPr>
-        <w:t>TÍCH LŨY TIÊU CỰC (Distribution):</w:t>
+        <w:t>TĂNG MẠNH MẼ (Strong Bullish Confirmation):</w:t>
       </w:r>
       <w:r>
-        <w:t xml:space="preserve"> Nến đi ngang nhưng dòng tiền rút dần (OI giảm), cảnh báo rủi ro suy sụt sắp tới.</w:t>
+        <w:t xml:space="preserve"> Mô hình nến tăng được củng cố bởi dòng tiền gia tăng tích cực, hỗ trợ lực mua lên bền vững.</w:t>
       </w:r>
     </w:p>
     <w:p>
@@ -11991,7 +11991,7 @@
               <w:rPr>
                 <w:b/>
               </w:rPr>
-              <w:t>88.67</w:t>
+              <w:t>88.84</w:t>
             </w:r>
           </w:p>
         </w:tc>
@@ -12022,7 +12022,7 @@
               <w:rPr>
                 <w:b/>
               </w:rPr>
-              <w:t>-2.01%</w:t>
+              <w:t>-1.82%</w:t>
             </w:r>
           </w:p>
         </w:tc>
@@ -12114,7 +12114,7 @@
               <w:rPr>
                 <w:b/>
               </w:rPr>
-              <w:t>99.54</w:t>
+              <w:t>99.52</w:t>
             </w:r>
           </w:p>
         </w:tc>
@@ -12145,7 +12145,7 @@
               <w:rPr>
                 <w:b/>
               </w:rPr>
-              <w:t>+0.11%</w:t>
+              <w:t>+0.09%</w:t>
             </w:r>
           </w:p>
         </w:tc>
@@ -12749,7 +12749,7 @@
         <w:t xml:space="preserve"> EMA_21 </w:t>
       </w:r>
       <w:r>
-        <w:t xml:space="preserve"> (536.90) &gt; </w:t>
+        <w:t xml:space="preserve"> (537.22) &gt; </w:t>
       </w:r>
       <w:r>
         <w:rPr>
@@ -12760,7 +12760,7 @@
         <w:t xml:space="preserve"> EMA_50 </w:t>
       </w:r>
       <w:r>
-        <w:t xml:space="preserve"> (535.59).</w:t>
+        <w:t xml:space="preserve"> (535.78).</w:t>
       </w:r>
     </w:p>
     <w:p>
@@ -12781,7 +12781,7 @@
         <w:rPr>
           <w:b/>
         </w:rPr>
-        <w:t>`51.16`</w:t>
+        <w:t>`55.41`</w:t>
       </w:r>
       <w:r>
         <w:t xml:space="preserve"> | ATR (14) = </w:t>
@@ -12790,7 +12790,7 @@
         <w:rPr>
           <w:b/>
         </w:rPr>
-        <w:t>`2.75`</w:t>
+        <w:t>`2.50`</w:t>
       </w:r>
       <w:r>
         <w:t xml:space="preserve"> cents | Volatility = </w:t>
@@ -12799,7 +12799,7 @@
         <w:rPr>
           <w:b/>
         </w:rPr>
-        <w:t>`1.50 cents`</w:t>
+        <w:t>`0.25 cents`</w:t>
       </w:r>
       <w:r>
         <w:t>.</w:t>
@@ -12823,7 +12823,7 @@
         <w:rPr>
           <w:b/>
         </w:rPr>
-        <w:t>`535.00`</w:t>
+        <w:t>`536.25`</w:t>
       </w:r>
       <w:r>
         <w:t xml:space="preserve"> | S2: </w:t>
@@ -12841,7 +12841,7 @@
         <w:rPr>
           <w:b/>
         </w:rPr>
-        <w:t>`538.75`</w:t>
+        <w:t>`540.50`</w:t>
       </w:r>
       <w:r>
         <w:t xml:space="preserve"> | R2: </w:t>
@@ -13584,7 +13584,7 @@
           <w:b/>
           <w:color w:val="15803D"/>
         </w:rPr>
-        <w:t>`535.00 - 536.90 cents (Canh mua vùng hỗ trợ)`</w:t>
+        <w:t>`536.25 - 537.22 cents (Canh mua vùng hỗ trợ)`</w:t>
       </w:r>
       <w:r>
         <w:t xml:space="preserve"> | SL: </w:t>
@@ -13593,7 +13593,7 @@
         <w:rPr>
           <w:b/>
         </w:rPr>
-        <w:t>`453.13 cents (Dưới cản S2 + 1.5x ATR)`</w:t>
+        <w:t>`453.50 cents (Dưới cản S2 + 1.5x ATR)`</w:t>
       </w:r>
       <w:r>
         <w:t xml:space="preserve"> | TP: </w:t>
@@ -13604,7 +13604,7 @@
           <w:color w:val="D97706"/>
           <w:sz w:val="19"/>
         </w:rPr>
-        <w:t xml:space="preserve"> 538.75 cents </w:t>
+        <w:t xml:space="preserve"> 540.50 cents </w:t>
       </w:r>
       <w:r>
         <w:t xml:space="preserve"> / </w:t>
@@ -13655,7 +13655,7 @@
         <w:rPr>
           <w:b/>
         </w:rPr>
-        <w:t>`533.50 - 535.00 cents`</w:t>
+        <w:t>`534.75 - 536.25 cents`</w:t>
       </w:r>
       <w:r>
         <w:t xml:space="preserve"> | SL: </w:t>
@@ -13664,7 +13664,7 @@
         <w:rPr>
           <w:b/>
         </w:rPr>
-        <w:t>`454.50 cents (Chống quét SL tuyệt đối)`</w:t>
+        <w:t>`454.75 cents (Chống quét SL tuyệt đối)`</w:t>
       </w:r>
       <w:r>
         <w:t xml:space="preserve"> | TP: </w:t>
@@ -13701,7 +13701,7 @@
         <w:rPr>
           <w:b/>
         </w:rPr>
-        <w:t>`538.75 - 540.25 cents`</w:t>
+        <w:t>`540.50 - 542.00 cents`</w:t>
       </w:r>
       <w:r>
         <w:t xml:space="preserve"> | SL: </w:t>
@@ -13710,7 +13710,7 @@
         <w:rPr>
           <w:b/>
         </w:rPr>
-        <w:t>`541.50 cents`</w:t>
+        <w:t>`543.00 cents`</w:t>
       </w:r>
       <w:r>
         <w:t xml:space="preserve"> | TP: </w:t>
@@ -13759,7 +13759,7 @@
         <w:rPr>
           <w:b/>
         </w:rPr>
-        <w:t>`446.27 - 457.25 cents`</w:t>
+        <w:t>`447.25 - 457.25 cents`</w:t>
       </w:r>
     </w:p>
     <w:p>
@@ -14166,7 +14166,7 @@
             </w:pPr>
             <w:r/>
             <w:r>
-              <w:t>537.25</w:t>
+              <w:t>539.00</w:t>
             </w:r>
           </w:p>
         </w:tc>
@@ -14194,7 +14194,7 @@
             </w:pPr>
             <w:r/>
             <w:r>
-              <w:t>541.00</w:t>
+              <w:t>542.75</w:t>
             </w:r>
           </w:p>
         </w:tc>
@@ -14222,7 +14222,7 @@
             </w:pPr>
             <w:r/>
             <w:r>
-              <w:t>534.00</w:t>
+              <w:t>535.75</w:t>
             </w:r>
           </w:p>
         </w:tc>
@@ -14253,7 +14253,7 @@
               <w:rPr>
                 <w:b/>
               </w:rPr>
-              <w:t>537.50</w:t>
+              <w:t>539.25</w:t>
             </w:r>
           </w:p>
         </w:tc>
@@ -14401,7 +14401,7 @@
             </w:pPr>
             <w:r/>
             <w:r>
-              <w:t>537.50</w:t>
+              <w:t>539.25</w:t>
             </w:r>
           </w:p>
         </w:tc>
@@ -14429,7 +14429,7 @@
             </w:pPr>
             <w:r/>
             <w:r>
-              <w:t>540.25</w:t>
+              <w:t>542.00</w:t>
             </w:r>
           </w:p>
         </w:tc>
@@ -14457,7 +14457,7 @@
             </w:pPr>
             <w:r/>
             <w:r>
-              <w:t>533.75</w:t>
+              <w:t>535.50</w:t>
             </w:r>
           </w:p>
         </w:tc>
@@ -14488,7 +14488,7 @@
               <w:rPr>
                 <w:b/>
               </w:rPr>
-              <w:t>537.00</w:t>
+              <w:t>538.75</w:t>
             </w:r>
           </w:p>
         </w:tc>
@@ -14636,7 +14636,7 @@
             </w:pPr>
             <w:r/>
             <w:r>
-              <w:t>537.00</w:t>
+              <w:t>538.75</w:t>
             </w:r>
           </w:p>
         </w:tc>
@@ -14664,7 +14664,7 @@
             </w:pPr>
             <w:r/>
             <w:r>
-              <w:t>540.00</w:t>
+              <w:t>541.75</w:t>
             </w:r>
           </w:p>
         </w:tc>
@@ -14692,7 +14692,7 @@
             </w:pPr>
             <w:r/>
             <w:r>
-              <w:t>533.00</w:t>
+              <w:t>534.75</w:t>
             </w:r>
           </w:p>
         </w:tc>
@@ -14723,7 +14723,7 @@
               <w:rPr>
                 <w:b/>
               </w:rPr>
-              <w:t>537.75</w:t>
+              <w:t>539.50</w:t>
             </w:r>
           </w:p>
         </w:tc>
@@ -14871,7 +14871,7 @@
             </w:pPr>
             <w:r/>
             <w:r>
-              <w:t>537.75</w:t>
+              <w:t>539.50</w:t>
             </w:r>
           </w:p>
         </w:tc>
@@ -14899,7 +14899,7 @@
             </w:pPr>
             <w:r/>
             <w:r>
-              <w:t>542.25</w:t>
+              <w:t>544.00</w:t>
             </w:r>
           </w:p>
         </w:tc>
@@ -14927,7 +14927,7 @@
             </w:pPr>
             <w:r/>
             <w:r>
-              <w:t>532.75</w:t>
+              <w:t>534.50</w:t>
             </w:r>
           </w:p>
         </w:tc>
@@ -14958,7 +14958,7 @@
               <w:rPr>
                 <w:b/>
               </w:rPr>
-              <w:t>538.50</w:t>
+              <w:t>540.25</w:t>
             </w:r>
           </w:p>
         </w:tc>
@@ -15106,7 +15106,7 @@
             </w:pPr>
             <w:r/>
             <w:r>
-              <w:t>538.50</w:t>
+              <w:t>540.25</w:t>
             </w:r>
           </w:p>
         </w:tc>
@@ -15134,7 +15134,7 @@
             </w:pPr>
             <w:r/>
             <w:r>
-              <w:t>544.00</w:t>
+              <w:t>545.75</w:t>
             </w:r>
           </w:p>
         </w:tc>
@@ -15162,7 +15162,7 @@
             </w:pPr>
             <w:r/>
             <w:r>
-              <w:t>532.25</w:t>
+              <w:t>534.00</w:t>
             </w:r>
           </w:p>
         </w:tc>
@@ -15193,7 +15193,7 @@
               <w:rPr>
                 <w:b/>
               </w:rPr>
-              <w:t>540.75</w:t>
+              <w:t>542.50</w:t>
             </w:r>
           </w:p>
         </w:tc>
@@ -15341,7 +15341,7 @@
             </w:pPr>
             <w:r/>
             <w:r>
-              <w:t>540.75</w:t>
+              <w:t>542.50</w:t>
             </w:r>
           </w:p>
         </w:tc>
@@ -15369,7 +15369,7 @@
             </w:pPr>
             <w:r/>
             <w:r>
-              <w:t>543.75</w:t>
+              <w:t>545.50</w:t>
             </w:r>
           </w:p>
         </w:tc>
@@ -15397,7 +15397,7 @@
             </w:pPr>
             <w:r/>
             <w:r>
-              <w:t>536.50</w:t>
+              <w:t>538.25</w:t>
             </w:r>
           </w:p>
         </w:tc>
@@ -15428,7 +15428,7 @@
               <w:rPr>
                 <w:b/>
               </w:rPr>
-              <w:t>541.00</w:t>
+              <w:t>542.75</w:t>
             </w:r>
           </w:p>
         </w:tc>
@@ -15576,7 +15576,7 @@
             </w:pPr>
             <w:r/>
             <w:r>
-              <w:t>541.00</w:t>
+              <w:t>542.75</w:t>
             </w:r>
           </w:p>
         </w:tc>
@@ -15604,7 +15604,7 @@
             </w:pPr>
             <w:r/>
             <w:r>
-              <w:t>544.25</w:t>
+              <w:t>546.00</w:t>
             </w:r>
           </w:p>
         </w:tc>
@@ -15632,7 +15632,7 @@
             </w:pPr>
             <w:r/>
             <w:r>
-              <w:t>534.50</w:t>
+              <w:t>536.25</w:t>
             </w:r>
           </w:p>
         </w:tc>
@@ -15663,7 +15663,7 @@
               <w:rPr>
                 <w:b/>
               </w:rPr>
-              <w:t>541.75</w:t>
+              <w:t>543.50</w:t>
             </w:r>
           </w:p>
         </w:tc>
@@ -15811,7 +15811,7 @@
             </w:pPr>
             <w:r/>
             <w:r>
-              <w:t>541.75</w:t>
+              <w:t>543.50</w:t>
             </w:r>
           </w:p>
         </w:tc>
@@ -15839,7 +15839,7 @@
             </w:pPr>
             <w:r/>
             <w:r>
-              <w:t>544.75</w:t>
+              <w:t>546.50</w:t>
             </w:r>
           </w:p>
         </w:tc>
@@ -15867,7 +15867,7 @@
             </w:pPr>
             <w:r/>
             <w:r>
-              <w:t>537.25</w:t>
+              <w:t>539.00</w:t>
             </w:r>
           </w:p>
         </w:tc>
@@ -15898,7 +15898,7 @@
               <w:rPr>
                 <w:b/>
               </w:rPr>
-              <w:t>541.25</w:t>
+              <w:t>543.00</w:t>
             </w:r>
           </w:p>
         </w:tc>
@@ -16046,7 +16046,7 @@
             </w:pPr>
             <w:r/>
             <w:r>
-              <w:t>541.25</w:t>
+              <w:t>543.00</w:t>
             </w:r>
           </w:p>
         </w:tc>
@@ -16074,7 +16074,7 @@
             </w:pPr>
             <w:r/>
             <w:r>
-              <w:t>545.25</w:t>
+              <w:t>547.00</w:t>
             </w:r>
           </w:p>
         </w:tc>
@@ -16102,7 +16102,7 @@
             </w:pPr>
             <w:r/>
             <w:r>
-              <w:t>535.50</w:t>
+              <w:t>537.25</w:t>
             </w:r>
           </w:p>
         </w:tc>
@@ -16133,7 +16133,7 @@
               <w:rPr>
                 <w:b/>
               </w:rPr>
-              <w:t>541.75</w:t>
+              <w:t>543.50</w:t>
             </w:r>
           </w:p>
         </w:tc>
@@ -16281,7 +16281,7 @@
             </w:pPr>
             <w:r/>
             <w:r>
-              <w:t>541.75</w:t>
+              <w:t>543.50</w:t>
             </w:r>
           </w:p>
         </w:tc>
@@ -16309,7 +16309,7 @@
             </w:pPr>
             <w:r/>
             <w:r>
-              <w:t>544.25</w:t>
+              <w:t>546.00</w:t>
             </w:r>
           </w:p>
         </w:tc>
@@ -16337,7 +16337,7 @@
             </w:pPr>
             <w:r/>
             <w:r>
-              <w:t>538.50</w:t>
+              <w:t>540.25</w:t>
             </w:r>
           </w:p>
         </w:tc>
@@ -16368,7 +16368,7 @@
               <w:rPr>
                 <w:b/>
               </w:rPr>
-              <w:t>542.25</w:t>
+              <w:t>544.00</w:t>
             </w:r>
           </w:p>
         </w:tc>
@@ -16516,7 +16516,7 @@
             </w:pPr>
             <w:r/>
             <w:r>
-              <w:t>542.25</w:t>
+              <w:t>544.00</w:t>
             </w:r>
           </w:p>
         </w:tc>
@@ -16544,7 +16544,7 @@
             </w:pPr>
             <w:r/>
             <w:r>
-              <w:t>545.75</w:t>
+              <w:t>547.50</w:t>
             </w:r>
           </w:p>
         </w:tc>
@@ -16572,7 +16572,7 @@
             </w:pPr>
             <w:r/>
             <w:r>
-              <w:t>536.25</w:t>
+              <w:t>538.00</w:t>
             </w:r>
           </w:p>
         </w:tc>
@@ -16603,7 +16603,7 @@
               <w:rPr>
                 <w:b/>
               </w:rPr>
-              <w:t>543.25</w:t>
+              <w:t>545.00</w:t>
             </w:r>
           </w:p>
         </w:tc>
@@ -16751,7 +16751,7 @@
             </w:pPr>
             <w:r/>
             <w:r>
-              <w:t>543.25</w:t>
+              <w:t>545.00</w:t>
             </w:r>
           </w:p>
         </w:tc>
@@ -16779,7 +16779,7 @@
             </w:pPr>
             <w:r/>
             <w:r>
-              <w:t>546.00</w:t>
+              <w:t>547.75</w:t>
             </w:r>
           </w:p>
         </w:tc>
@@ -16807,7 +16807,7 @@
             </w:pPr>
             <w:r/>
             <w:r>
-              <w:t>540.75</w:t>
+              <w:t>542.50</w:t>
             </w:r>
           </w:p>
         </w:tc>
@@ -16838,7 +16838,7 @@
               <w:rPr>
                 <w:b/>
               </w:rPr>
-              <w:t>543.25</w:t>
+              <w:t>545.00</w:t>
             </w:r>
           </w:p>
         </w:tc>
@@ -16986,7 +16986,7 @@
             </w:pPr>
             <w:r/>
             <w:r>
-              <w:t>543.25</w:t>
+              <w:t>545.00</w:t>
             </w:r>
           </w:p>
         </w:tc>
@@ -17014,7 +17014,7 @@
             </w:pPr>
             <w:r/>
             <w:r>
-              <w:t>546.00</w:t>
+              <w:t>547.75</w:t>
             </w:r>
           </w:p>
         </w:tc>
@@ -17042,7 +17042,7 @@
             </w:pPr>
             <w:r/>
             <w:r>
-              <w:t>540.75</w:t>
+              <w:t>542.50</w:t>
             </w:r>
           </w:p>
         </w:tc>
@@ -17073,7 +17073,7 @@
               <w:rPr>
                 <w:b/>
               </w:rPr>
-              <w:t>542.75</w:t>
+              <w:t>544.50</w:t>
             </w:r>
           </w:p>
         </w:tc>
@@ -17221,7 +17221,7 @@
             </w:pPr>
             <w:r/>
             <w:r>
-              <w:t>542.75</w:t>
+              <w:t>544.50</w:t>
             </w:r>
           </w:p>
         </w:tc>
@@ -17249,7 +17249,7 @@
             </w:pPr>
             <w:r/>
             <w:r>
-              <w:t>545.75</w:t>
+              <w:t>547.50</w:t>
             </w:r>
           </w:p>
         </w:tc>
@@ -17277,7 +17277,7 @@
             </w:pPr>
             <w:r/>
             <w:r>
-              <w:t>539.50</w:t>
+              <w:t>541.25</w:t>
             </w:r>
           </w:p>
         </w:tc>
@@ -17308,7 +17308,7 @@
               <w:rPr>
                 <w:b/>
               </w:rPr>
-              <w:t>542.50</w:t>
+              <w:t>544.25</w:t>
             </w:r>
           </w:p>
         </w:tc>
@@ -17456,7 +17456,7 @@
             </w:pPr>
             <w:r/>
             <w:r>
-              <w:t>542.50</w:t>
+              <w:t>544.25</w:t>
             </w:r>
           </w:p>
         </w:tc>
@@ -17484,7 +17484,7 @@
             </w:pPr>
             <w:r/>
             <w:r>
-              <w:t>546.50</w:t>
+              <w:t>548.25</w:t>
             </w:r>
           </w:p>
         </w:tc>
@@ -17512,7 +17512,7 @@
             </w:pPr>
             <w:r/>
             <w:r>
-              <w:t>537.25</w:t>
+              <w:t>539.00</w:t>
             </w:r>
           </w:p>
         </w:tc>
@@ -17543,7 +17543,7 @@
               <w:rPr>
                 <w:b/>
               </w:rPr>
-              <w:t>543.00</w:t>
+              <w:t>544.75</w:t>
             </w:r>
           </w:p>
         </w:tc>
@@ -17691,7 +17691,7 @@
             </w:pPr>
             <w:r/>
             <w:r>
-              <w:t>543.00</w:t>
+              <w:t>544.75</w:t>
             </w:r>
           </w:p>
         </w:tc>
@@ -17719,7 +17719,7 @@
             </w:pPr>
             <w:r/>
             <w:r>
-              <w:t>547.75</w:t>
+              <w:t>549.50</w:t>
             </w:r>
           </w:p>
         </w:tc>
@@ -17747,7 +17747,7 @@
             </w:pPr>
             <w:r/>
             <w:r>
-              <w:t>536.00</w:t>
+              <w:t>537.75</w:t>
             </w:r>
           </w:p>
         </w:tc>
@@ -17778,7 +17778,7 @@
               <w:rPr>
                 <w:b/>
               </w:rPr>
-              <w:t>545.00</w:t>
+              <w:t>546.75</w:t>
             </w:r>
           </w:p>
         </w:tc>
@@ -17926,7 +17926,7 @@
             </w:pPr>
             <w:r/>
             <w:r>
-              <w:t>545.00</w:t>
+              <w:t>546.75</w:t>
             </w:r>
           </w:p>
         </w:tc>
@@ -17954,7 +17954,7 @@
             </w:pPr>
             <w:r/>
             <w:r>
-              <w:t>553.00</w:t>
+              <w:t>554.75</w:t>
             </w:r>
           </w:p>
         </w:tc>
@@ -17982,7 +17982,7 @@
             </w:pPr>
             <w:r/>
             <w:r>
-              <w:t>538.00</w:t>
+              <w:t>539.75</w:t>
             </w:r>
           </w:p>
         </w:tc>
@@ -18013,7 +18013,7 @@
               <w:rPr>
                 <w:b/>
               </w:rPr>
-              <w:t>546.50</w:t>
+              <w:t>548.25</w:t>
             </w:r>
           </w:p>
         </w:tc>
@@ -18161,7 +18161,7 @@
             </w:pPr>
             <w:r/>
             <w:r>
-              <w:t>546.50</w:t>
+              <w:t>548.25</w:t>
             </w:r>
           </w:p>
         </w:tc>
@@ -18189,7 +18189,7 @@
             </w:pPr>
             <w:r/>
             <w:r>
-              <w:t>551.00</w:t>
+              <w:t>552.75</w:t>
             </w:r>
           </w:p>
         </w:tc>
@@ -18217,7 +18217,7 @@
             </w:pPr>
             <w:r/>
             <w:r>
-              <w:t>542.25</w:t>
+              <w:t>544.00</w:t>
             </w:r>
           </w:p>
         </w:tc>
@@ -18248,7 +18248,7 @@
               <w:rPr>
                 <w:b/>
               </w:rPr>
-              <w:t>546.00</w:t>
+              <w:t>547.75</w:t>
             </w:r>
           </w:p>
         </w:tc>
@@ -18396,7 +18396,7 @@
             </w:pPr>
             <w:r/>
             <w:r>
-              <w:t>546.00</w:t>
+              <w:t>547.75</w:t>
             </w:r>
           </w:p>
         </w:tc>
@@ -18424,7 +18424,7 @@
             </w:pPr>
             <w:r/>
             <w:r>
-              <w:t>548.25</w:t>
+              <w:t>550.00</w:t>
             </w:r>
           </w:p>
         </w:tc>
@@ -18452,7 +18452,7 @@
             </w:pPr>
             <w:r/>
             <w:r>
-              <w:t>543.25</w:t>
+              <w:t>545.00</w:t>
             </w:r>
           </w:p>
         </w:tc>
@@ -18483,7 +18483,7 @@
               <w:rPr>
                 <w:b/>
               </w:rPr>
-              <w:t>545.75</w:t>
+              <w:t>547.50</w:t>
             </w:r>
           </w:p>
         </w:tc>
@@ -18631,7 +18631,7 @@
             </w:pPr>
             <w:r/>
             <w:r>
-              <w:t>545.75</w:t>
+              <w:t>547.50</w:t>
             </w:r>
           </w:p>
         </w:tc>
@@ -18659,7 +18659,7 @@
             </w:pPr>
             <w:r/>
             <w:r>
-              <w:t>547.75</w:t>
+              <w:t>549.50</w:t>
             </w:r>
           </w:p>
         </w:tc>
@@ -18687,7 +18687,7 @@
             </w:pPr>
             <w:r/>
             <w:r>
-              <w:t>541.25</w:t>
+              <w:t>543.00</w:t>
             </w:r>
           </w:p>
         </w:tc>
@@ -18718,7 +18718,7 @@
               <w:rPr>
                 <w:b/>
               </w:rPr>
-              <w:t>546.00</w:t>
+              <w:t>547.75</w:t>
             </w:r>
           </w:p>
         </w:tc>
@@ -18866,7 +18866,7 @@
             </w:pPr>
             <w:r/>
             <w:r>
-              <w:t>546.00</w:t>
+              <w:t>547.75</w:t>
             </w:r>
           </w:p>
         </w:tc>
@@ -18894,7 +18894,7 @@
             </w:pPr>
             <w:r/>
             <w:r>
-              <w:t>549.75</w:t>
+              <w:t>551.50</w:t>
             </w:r>
           </w:p>
         </w:tc>
@@ -18922,7 +18922,7 @@
             </w:pPr>
             <w:r/>
             <w:r>
-              <w:t>543.25</w:t>
+              <w:t>545.00</w:t>
             </w:r>
           </w:p>
         </w:tc>
@@ -18953,7 +18953,7 @@
               <w:rPr>
                 <w:b/>
               </w:rPr>
-              <w:t>546.50</w:t>
+              <w:t>548.25</w:t>
             </w:r>
           </w:p>
         </w:tc>
@@ -19101,7 +19101,7 @@
             </w:pPr>
             <w:r/>
             <w:r>
-              <w:t>546.50</w:t>
+              <w:t>548.25</w:t>
             </w:r>
           </w:p>
         </w:tc>
@@ -19129,7 +19129,7 @@
             </w:pPr>
             <w:r/>
             <w:r>
-              <w:t>549.50</w:t>
+              <w:t>551.25</w:t>
             </w:r>
           </w:p>
         </w:tc>
@@ -19157,7 +19157,7 @@
             </w:pPr>
             <w:r/>
             <w:r>
-              <w:t>542.00</w:t>
+              <w:t>543.75</w:t>
             </w:r>
           </w:p>
         </w:tc>
@@ -19188,7 +19188,7 @@
               <w:rPr>
                 <w:b/>
               </w:rPr>
-              <w:t>546.75</w:t>
+              <w:t>548.50</w:t>
             </w:r>
           </w:p>
         </w:tc>
@@ -19336,7 +19336,7 @@
             </w:pPr>
             <w:r/>
             <w:r>
-              <w:t>546.75</w:t>
+              <w:t>548.50</w:t>
             </w:r>
           </w:p>
         </w:tc>
@@ -19364,7 +19364,7 @@
             </w:pPr>
             <w:r/>
             <w:r>
-              <w:t>551.00</w:t>
+              <w:t>552.75</w:t>
             </w:r>
           </w:p>
         </w:tc>
@@ -19392,7 +19392,7 @@
             </w:pPr>
             <w:r/>
             <w:r>
-              <w:t>543.50</w:t>
+              <w:t>545.25</w:t>
             </w:r>
           </w:p>
         </w:tc>
@@ -19423,7 +19423,7 @@
               <w:rPr>
                 <w:b/>
               </w:rPr>
-              <w:t>547.50</w:t>
+              <w:t>549.25</w:t>
             </w:r>
           </w:p>
         </w:tc>
@@ -19571,7 +19571,7 @@
             </w:pPr>
             <w:r/>
             <w:r>
-              <w:t>547.50</w:t>
+              <w:t>549.25</w:t>
             </w:r>
           </w:p>
         </w:tc>
@@ -19599,7 +19599,7 @@
             </w:pPr>
             <w:r/>
             <w:r>
-              <w:t>551.00</w:t>
+              <w:t>552.75</w:t>
             </w:r>
           </w:p>
         </w:tc>
@@ -19627,7 +19627,7 @@
             </w:pPr>
             <w:r/>
             <w:r>
-              <w:t>545.25</w:t>
+              <w:t>547.00</w:t>
             </w:r>
           </w:p>
         </w:tc>
@@ -19658,7 +19658,7 @@
               <w:rPr>
                 <w:b/>
               </w:rPr>
-              <w:t>547.50</w:t>
+              <w:t>549.25</w:t>
             </w:r>
           </w:p>
         </w:tc>
@@ -19806,7 +19806,7 @@
             </w:pPr>
             <w:r/>
             <w:r>
-              <w:t>547.50</w:t>
+              <w:t>549.25</w:t>
             </w:r>
           </w:p>
         </w:tc>
@@ -19834,7 +19834,7 @@
             </w:pPr>
             <w:r/>
             <w:r>
-              <w:t>551.25</w:t>
+              <w:t>553.00</w:t>
             </w:r>
           </w:p>
         </w:tc>
@@ -19862,7 +19862,7 @@
             </w:pPr>
             <w:r/>
             <w:r>
-              <w:t>544.00</w:t>
+              <w:t>545.75</w:t>
             </w:r>
           </w:p>
         </w:tc>
@@ -19893,7 +19893,7 @@
               <w:rPr>
                 <w:b/>
               </w:rPr>
-              <w:t>547.25</w:t>
+              <w:t>549.00</w:t>
             </w:r>
           </w:p>
         </w:tc>
@@ -20041,7 +20041,7 @@
             </w:pPr>
             <w:r/>
             <w:r>
-              <w:t>547.25</w:t>
+              <w:t>549.00</w:t>
             </w:r>
           </w:p>
         </w:tc>
@@ -20069,7 +20069,7 @@
             </w:pPr>
             <w:r/>
             <w:r>
-              <w:t>550.75</w:t>
+              <w:t>552.50</w:t>
             </w:r>
           </w:p>
         </w:tc>
@@ -20097,7 +20097,7 @@
             </w:pPr>
             <w:r/>
             <w:r>
-              <w:t>544.00</w:t>
+              <w:t>545.75</w:t>
             </w:r>
           </w:p>
         </w:tc>
@@ -20128,7 +20128,7 @@
               <w:rPr>
                 <w:b/>
               </w:rPr>
-              <w:t>547.00</w:t>
+              <w:t>548.75</w:t>
             </w:r>
           </w:p>
         </w:tc>
@@ -20276,7 +20276,7 @@
             </w:pPr>
             <w:r/>
             <w:r>
-              <w:t>547.00</w:t>
+              <w:t>548.75</w:t>
             </w:r>
           </w:p>
         </w:tc>
@@ -20304,7 +20304,7 @@
             </w:pPr>
             <w:r/>
             <w:r>
-              <w:t>550.00</w:t>
+              <w:t>551.75</w:t>
             </w:r>
           </w:p>
         </w:tc>
@@ -20332,7 +20332,7 @@
             </w:pPr>
             <w:r/>
             <w:r>
-              <w:t>544.25</w:t>
+              <w:t>546.00</w:t>
             </w:r>
           </w:p>
         </w:tc>
@@ -20363,7 +20363,7 @@
               <w:rPr>
                 <w:b/>
               </w:rPr>
-              <w:t>547.25</w:t>
+              <w:t>549.00</w:t>
             </w:r>
           </w:p>
         </w:tc>
@@ -20511,7 +20511,7 @@
             </w:pPr>
             <w:r/>
             <w:r>
-              <w:t>547.25</w:t>
+              <w:t>549.00</w:t>
             </w:r>
           </w:p>
         </w:tc>
@@ -20539,7 +20539,7 @@
             </w:pPr>
             <w:r/>
             <w:r>
-              <w:t>550.25</w:t>
+              <w:t>552.00</w:t>
             </w:r>
           </w:p>
         </w:tc>
@@ -20567,7 +20567,7 @@
             </w:pPr>
             <w:r/>
             <w:r>
-              <w:t>544.50</w:t>
+              <w:t>546.25</w:t>
             </w:r>
           </w:p>
         </w:tc>
@@ -20598,7 +20598,7 @@
               <w:rPr>
                 <w:b/>
               </w:rPr>
-              <w:t>547.25</w:t>
+              <w:t>549.00</w:t>
             </w:r>
           </w:p>
         </w:tc>
@@ -20746,7 +20746,7 @@
             </w:pPr>
             <w:r/>
             <w:r>
-              <w:t>547.25</w:t>
+              <w:t>549.00</w:t>
             </w:r>
           </w:p>
         </w:tc>
@@ -20774,7 +20774,7 @@
             </w:pPr>
             <w:r/>
             <w:r>
-              <w:t>551.25</w:t>
+              <w:t>553.00</w:t>
             </w:r>
           </w:p>
         </w:tc>
@@ -20802,7 +20802,7 @@
             </w:pPr>
             <w:r/>
             <w:r>
-              <w:t>543.75</w:t>
+              <w:t>545.50</w:t>
             </w:r>
           </w:p>
         </w:tc>
@@ -20833,7 +20833,7 @@
               <w:rPr>
                 <w:b/>
               </w:rPr>
-              <w:t>547.75</w:t>
+              <w:t>549.50</w:t>
             </w:r>
           </w:p>
         </w:tc>
@@ -20981,7 +20981,7 @@
             </w:pPr>
             <w:r/>
             <w:r>
-              <w:t>547.75</w:t>
+              <w:t>549.50</w:t>
             </w:r>
           </w:p>
         </w:tc>
@@ -21009,7 +21009,7 @@
             </w:pPr>
             <w:r/>
             <w:r>
-              <w:t>551.75</w:t>
+              <w:t>553.50</w:t>
             </w:r>
           </w:p>
         </w:tc>
@@ -21037,7 +21037,7 @@
             </w:pPr>
             <w:r/>
             <w:r>
-              <w:t>546.00</w:t>
+              <w:t>547.75</w:t>
             </w:r>
           </w:p>
         </w:tc>
@@ -21068,7 +21068,7 @@
               <w:rPr>
                 <w:b/>
               </w:rPr>
-              <w:t>547.50</w:t>
+              <w:t>549.25</w:t>
             </w:r>
           </w:p>
         </w:tc>
@@ -21791,7 +21791,7 @@
         <w:t>Giá Chốt Phiên (Close):</w:t>
       </w:r>
       <w:r>
-        <w:t xml:space="preserve"> 773.25 cents | </w:t>
+        <w:t xml:space="preserve"> 779.25 cents | </w:t>
       </w:r>
       <w:r>
         <w:rPr>
@@ -21806,10 +21806,10 @@
         <w:rPr>
           <w:b/>
         </w:rPr>
-        <w:t>`777.81 cents`</w:t>
+        <w:t>`783.89 cents`</w:t>
       </w:r>
       <w:r>
-        <w:t xml:space="preserve"> (+4.56).</w:t>
+        <w:t xml:space="preserve"> (+4.64).</w:t>
       </w:r>
     </w:p>
     <w:p>
@@ -21830,7 +21830,7 @@
         <w:rPr>
           <w:b/>
         </w:rPr>
-        <w:t>`7,509`</w:t>
+        <w:t>`9,248`</w:t>
       </w:r>
       <w:r>
         <w:t xml:space="preserve"> (Chênh lệch: </w:t>
@@ -21839,7 +21839,7 @@
         <w:rPr>
           <w:b/>
         </w:rPr>
-        <w:t>`-128,957`</w:t>
+        <w:t>`-127,218`</w:t>
       </w:r>
       <w:r>
         <w:t xml:space="preserve">) | OI: </w:t>
@@ -21881,7 +21881,7 @@
         <w:rPr>
           <w:b/>
         </w:rPr>
-        <w:t>`Không phát hiện mô hình nến đặc biệt`</w:t>
+        <w:t>`Doji (Nến lưỡng lự thế trận)`</w:t>
       </w:r>
     </w:p>
     <w:p>
@@ -21901,9 +21901,9 @@
       <w:r>
         <w:rPr>
           <w:b/>
-          <w:color w:val="15803D"/>
+          <w:color w:val="B91C1C"/>
         </w:rPr>
-        <w:t>`Giảm suy yếu / Đáy ngắn hạn (Long Liquidation Decline)`</w:t>
+        <w:t>`Tăng yếu / Rủi ro đảo chiều (Short Covering Rally)`</w:t>
       </w:r>
     </w:p>
     <w:p>
@@ -21924,10 +21924,10 @@
         <w:rPr>
           <w:b/>
         </w:rPr>
-        <w:t>TÍCH LŨY TIÊU CỰC (Distribution):</w:t>
+        <w:t>TÍCH LŨY TÍCH CỰC (Accumulation):</w:t>
       </w:r>
       <w:r>
-        <w:t xml:space="preserve"> Nến đi ngang nhưng dòng tiền rút dần (OI giảm), cảnh báo rủi ro suy sụt sắp tới.</w:t>
+        <w:t xml:space="preserve"> Nến đi ngang nhưng dòng tiền âm thầm gia tăng (OI tăng), báo hiệu chuẩn bị có nhịp bứt phá tăng.</w:t>
       </w:r>
     </w:p>
     <w:p>
@@ -22173,7 +22173,7 @@
               <w:rPr>
                 <w:b/>
               </w:rPr>
-              <w:t>88.67</w:t>
+              <w:t>88.84</w:t>
             </w:r>
           </w:p>
         </w:tc>
@@ -22204,7 +22204,7 @@
               <w:rPr>
                 <w:b/>
               </w:rPr>
-              <w:t>-2.01%</w:t>
+              <w:t>-1.82%</w:t>
             </w:r>
           </w:p>
         </w:tc>
@@ -22296,7 +22296,7 @@
               <w:rPr>
                 <w:b/>
               </w:rPr>
-              <w:t>99.54</w:t>
+              <w:t>99.52</w:t>
             </w:r>
           </w:p>
         </w:tc>
@@ -22327,7 +22327,7 @@
               <w:rPr>
                 <w:b/>
               </w:rPr>
-              <w:t>+0.11%</w:t>
+              <w:t>+0.09%</w:t>
             </w:r>
           </w:p>
         </w:tc>
@@ -22941,7 +22941,7 @@
         <w:t xml:space="preserve"> EMA_21 </w:t>
       </w:r>
       <w:r>
-        <w:t xml:space="preserve"> (771.15) &gt; </w:t>
+        <w:t xml:space="preserve"> (772.36) &gt; </w:t>
       </w:r>
       <w:r>
         <w:rPr>
@@ -22952,7 +22952,7 @@
         <w:t xml:space="preserve"> EMA_50 </w:t>
       </w:r>
       <w:r>
-        <w:t xml:space="preserve"> (765.46).</w:t>
+        <w:t xml:space="preserve"> (766.22).</w:t>
       </w:r>
     </w:p>
     <w:p>
@@ -22973,7 +22973,7 @@
         <w:rPr>
           <w:b/>
         </w:rPr>
-        <w:t>`52.73`</w:t>
+        <w:t>`58.02`</w:t>
       </w:r>
       <w:r>
         <w:t xml:space="preserve"> | ATR (14) = </w:t>
@@ -22982,7 +22982,7 @@
         <w:rPr>
           <w:b/>
         </w:rPr>
-        <w:t>`6.30`</w:t>
+        <w:t>`6.24`</w:t>
       </w:r>
       <w:r>
         <w:t xml:space="preserve"> cents | Volatility = </w:t>
@@ -22991,7 +22991,7 @@
         <w:rPr>
           <w:b/>
         </w:rPr>
-        <w:t>`2.50 cents`</w:t>
+        <w:t>`1.25 cents`</w:t>
       </w:r>
       <w:r>
         <w:t>.</w:t>
@@ -23015,7 +23015,7 @@
         <w:rPr>
           <w:b/>
         </w:rPr>
-        <w:t>`770.00`</w:t>
+        <w:t>`774.25`</w:t>
       </w:r>
       <w:r>
         <w:t xml:space="preserve"> | S2: </w:t>
@@ -23033,7 +23033,7 @@
         <w:rPr>
           <w:b/>
         </w:rPr>
-        <w:t>`780.00`</w:t>
+        <w:t>`782.75`</w:t>
       </w:r>
       <w:r>
         <w:t xml:space="preserve"> | R2: </w:t>
@@ -23766,7 +23766,7 @@
           <w:b/>
           <w:color w:val="B91C1C"/>
         </w:rPr>
-        <w:t>`771.15 - 765.46 cents (Canh bán hồi kỹ thuật H1)`</w:t>
+        <w:t>`772.36 - 766.22 cents (Canh bán hồi kỹ thuật H1)`</w:t>
       </w:r>
       <w:r>
         <w:t xml:space="preserve"> | SL: </w:t>
@@ -23775,7 +23775,7 @@
         <w:rPr>
           <w:b/>
         </w:rPr>
-        <w:t>`799.70 cents (Trên kháng cự R2 + 1.5x ATR)`</w:t>
+        <w:t>`799.60 cents (Trên kháng cự R2 + 1.5x ATR)`</w:t>
       </w:r>
       <w:r>
         <w:t xml:space="preserve"> | TP: </w:t>
@@ -23786,7 +23786,7 @@
           <w:color w:val="D97706"/>
           <w:sz w:val="19"/>
         </w:rPr>
-        <w:t xml:space="preserve"> 770.00 cents </w:t>
+        <w:t xml:space="preserve"> 774.25 cents </w:t>
       </w:r>
       <w:r>
         <w:t xml:space="preserve"> / </w:t>
@@ -23837,7 +23837,7 @@
         <w:rPr>
           <w:b/>
         </w:rPr>
-        <w:t>`768.00 - 770.00 cents`</w:t>
+        <w:t>`772.25 - 774.25 cents`</w:t>
       </w:r>
       <w:r>
         <w:t xml:space="preserve"> | SL: </w:t>
@@ -23846,7 +23846,7 @@
         <w:rPr>
           <w:b/>
         </w:rPr>
-        <w:t>`638.95 cents`</w:t>
+        <w:t>`639.01 cents`</w:t>
       </w:r>
       <w:r>
         <w:t xml:space="preserve"> | TP: </w:t>
@@ -23855,7 +23855,7 @@
         <w:rPr>
           <w:b/>
         </w:rPr>
-        <w:t>`780.00 cents (Đón sóng hồi trung hạn ~14.5 giá)`</w:t>
+        <w:t>`782.75 cents (Đón sóng hồi trung hạn ~14.5 giá)`</w:t>
       </w:r>
       <w:r>
         <w:t>.</w:t>
@@ -23883,7 +23883,7 @@
         <w:rPr>
           <w:b/>
         </w:rPr>
-        <w:t>`780.00 - 782.00 cents`</w:t>
+        <w:t>`782.75 - 784.75 cents`</w:t>
       </w:r>
       <w:r>
         <w:t xml:space="preserve"> | SL: </w:t>
@@ -23892,7 +23892,7 @@
         <w:rPr>
           <w:b/>
         </w:rPr>
-        <w:t>`786.30 cents`</w:t>
+        <w:t>`788.99 cents`</w:t>
       </w:r>
       <w:r>
         <w:t xml:space="preserve"> | TP: </w:t>
@@ -23941,7 +23941,7 @@
         <w:rPr>
           <w:b/>
         </w:rPr>
-        <w:t>`620.04 - 645.25 cents`</w:t>
+        <w:t>`620.31 - 645.25 cents`</w:t>
       </w:r>
     </w:p>
     <w:p>
@@ -24348,7 +24348,7 @@
             </w:pPr>
             <w:r/>
             <w:r>
-              <w:t>773.25</w:t>
+              <w:t>779.25</w:t>
             </w:r>
           </w:p>
         </w:tc>
@@ -24376,7 +24376,7 @@
             </w:pPr>
             <w:r/>
             <w:r>
-              <w:t>784.50</w:t>
+              <w:t>790.50</w:t>
             </w:r>
           </w:p>
         </w:tc>
@@ -24404,7 +24404,7 @@
             </w:pPr>
             <w:r/>
             <w:r>
-              <w:t>767.75</w:t>
+              <w:t>773.75</w:t>
             </w:r>
           </w:p>
         </w:tc>
@@ -24435,7 +24435,7 @@
               <w:rPr>
                 <w:b/>
               </w:rPr>
-              <w:t>772.50</w:t>
+              <w:t>778.50</w:t>
             </w:r>
           </w:p>
         </w:tc>
@@ -24583,7 +24583,7 @@
             </w:pPr>
             <w:r/>
             <w:r>
-              <w:t>772.50</w:t>
+              <w:t>778.50</w:t>
             </w:r>
           </w:p>
         </w:tc>
@@ -24611,7 +24611,7 @@
             </w:pPr>
             <w:r/>
             <w:r>
-              <w:t>780.00</w:t>
+              <w:t>786.00</w:t>
             </w:r>
           </w:p>
         </w:tc>
@@ -24639,7 +24639,7 @@
             </w:pPr>
             <w:r/>
             <w:r>
-              <w:t>766.50</w:t>
+              <w:t>772.50</w:t>
             </w:r>
           </w:p>
         </w:tc>
@@ -24670,7 +24670,7 @@
               <w:rPr>
                 <w:b/>
               </w:rPr>
-              <w:t>772.00</w:t>
+              <w:t>778.00</w:t>
             </w:r>
           </w:p>
         </w:tc>
@@ -24818,7 +24818,7 @@
             </w:pPr>
             <w:r/>
             <w:r>
-              <w:t>772.00</w:t>
+              <w:t>778.00</w:t>
             </w:r>
           </w:p>
         </w:tc>
@@ -24846,7 +24846,7 @@
             </w:pPr>
             <w:r/>
             <w:r>
-              <w:t>785.75</w:t>
+              <w:t>791.75</w:t>
             </w:r>
           </w:p>
         </w:tc>
@@ -24874,7 +24874,7 @@
             </w:pPr>
             <w:r/>
             <w:r>
-              <w:t>757.25</w:t>
+              <w:t>763.25</w:t>
             </w:r>
           </w:p>
         </w:tc>
@@ -24905,7 +24905,7 @@
               <w:rPr>
                 <w:b/>
               </w:rPr>
-              <w:t>774.00</w:t>
+              <w:t>780.00</w:t>
             </w:r>
           </w:p>
         </w:tc>
@@ -25053,7 +25053,7 @@
             </w:pPr>
             <w:r/>
             <w:r>
-              <w:t>774.00</w:t>
+              <w:t>780.00</w:t>
             </w:r>
           </w:p>
         </w:tc>
@@ -25081,7 +25081,7 @@
             </w:pPr>
             <w:r/>
             <w:r>
-              <w:t>787.25</w:t>
+              <w:t>793.25</w:t>
             </w:r>
           </w:p>
         </w:tc>
@@ -25109,7 +25109,7 @@
             </w:pPr>
             <w:r/>
             <w:r>
-              <w:t>765.75</w:t>
+              <w:t>771.75</w:t>
             </w:r>
           </w:p>
         </w:tc>
@@ -25140,7 +25140,7 @@
               <w:rPr>
                 <w:b/>
               </w:rPr>
-              <w:t>775.25</w:t>
+              <w:t>781.25</w:t>
             </w:r>
           </w:p>
         </w:tc>
@@ -25288,7 +25288,7 @@
             </w:pPr>
             <w:r/>
             <w:r>
-              <w:t>775.25</w:t>
+              <w:t>781.25</w:t>
             </w:r>
           </w:p>
         </w:tc>
@@ -25316,7 +25316,7 @@
             </w:pPr>
             <w:r/>
             <w:r>
-              <w:t>791.75</w:t>
+              <w:t>797.75</w:t>
             </w:r>
           </w:p>
         </w:tc>
@@ -25344,7 +25344,7 @@
             </w:pPr>
             <w:r/>
             <w:r>
-              <w:t>764.75</w:t>
+              <w:t>770.75</w:t>
             </w:r>
           </w:p>
         </w:tc>
@@ -25375,7 +25375,7 @@
               <w:rPr>
                 <w:b/>
               </w:rPr>
-              <w:t>779.75</w:t>
+              <w:t>785.75</w:t>
             </w:r>
           </w:p>
         </w:tc>
@@ -25523,7 +25523,7 @@
             </w:pPr>
             <w:r/>
             <w:r>
-              <w:t>779.75</w:t>
+              <w:t>785.75</w:t>
             </w:r>
           </w:p>
         </w:tc>
@@ -25551,7 +25551,7 @@
             </w:pPr>
             <w:r/>
             <w:r>
-              <w:t>787.50</w:t>
+              <w:t>793.50</w:t>
             </w:r>
           </w:p>
         </w:tc>
@@ -25579,7 +25579,7 @@
             </w:pPr>
             <w:r/>
             <w:r>
-              <w:t>768.75</w:t>
+              <w:t>774.75</w:t>
             </w:r>
           </w:p>
         </w:tc>
@@ -25610,7 +25610,7 @@
               <w:rPr>
                 <w:b/>
               </w:rPr>
-              <w:t>781.00</w:t>
+              <w:t>787.00</w:t>
             </w:r>
           </w:p>
         </w:tc>
@@ -25758,7 +25758,7 @@
             </w:pPr>
             <w:r/>
             <w:r>
-              <w:t>781.00</w:t>
+              <w:t>787.00</w:t>
             </w:r>
           </w:p>
         </w:tc>
@@ -25786,7 +25786,7 @@
             </w:pPr>
             <w:r/>
             <w:r>
-              <w:t>789.25</w:t>
+              <w:t>795.25</w:t>
             </w:r>
           </w:p>
         </w:tc>
@@ -25814,7 +25814,7 @@
             </w:pPr>
             <w:r/>
             <w:r>
-              <w:t>770.50</w:t>
+              <w:t>776.50</w:t>
             </w:r>
           </w:p>
         </w:tc>
@@ -25845,7 +25845,7 @@
               <w:rPr>
                 <w:b/>
               </w:rPr>
-              <w:t>782.75</w:t>
+              <w:t>788.75</w:t>
             </w:r>
           </w:p>
         </w:tc>
@@ -25993,7 +25993,7 @@
             </w:pPr>
             <w:r/>
             <w:r>
-              <w:t>782.75</w:t>
+              <w:t>788.75</w:t>
             </w:r>
           </w:p>
         </w:tc>
@@ -26021,7 +26021,7 @@
             </w:pPr>
             <w:r/>
             <w:r>
-              <w:t>795.00</w:t>
+              <w:t>801.00</w:t>
             </w:r>
           </w:p>
         </w:tc>
@@ -26049,7 +26049,7 @@
             </w:pPr>
             <w:r/>
             <w:r>
-              <w:t>773.00</w:t>
+              <w:t>779.00</w:t>
             </w:r>
           </w:p>
         </w:tc>
@@ -26080,7 +26080,7 @@
               <w:rPr>
                 <w:b/>
               </w:rPr>
-              <w:t>781.75</w:t>
+              <w:t>787.75</w:t>
             </w:r>
           </w:p>
         </w:tc>
@@ -26228,7 +26228,7 @@
             </w:pPr>
             <w:r/>
             <w:r>
-              <w:t>781.75</w:t>
+              <w:t>787.75</w:t>
             </w:r>
           </w:p>
         </w:tc>
@@ -26256,7 +26256,7 @@
             </w:pPr>
             <w:r/>
             <w:r>
-              <w:t>792.25</w:t>
+              <w:t>798.25</w:t>
             </w:r>
           </w:p>
         </w:tc>
@@ -26284,7 +26284,7 @@
             </w:pPr>
             <w:r/>
             <w:r>
-              <w:t>767.00</w:t>
+              <w:t>773.00</w:t>
             </w:r>
           </w:p>
         </w:tc>
@@ -26315,7 +26315,7 @@
               <w:rPr>
                 <w:b/>
               </w:rPr>
-              <w:t>784.00</w:t>
+              <w:t>790.00</w:t>
             </w:r>
           </w:p>
         </w:tc>
@@ -26463,7 +26463,7 @@
             </w:pPr>
             <w:r/>
             <w:r>
-              <w:t>784.00</w:t>
+              <w:t>790.00</w:t>
             </w:r>
           </w:p>
         </w:tc>
@@ -26491,7 +26491,7 @@
             </w:pPr>
             <w:r/>
             <w:r>
-              <w:t>794.50</w:t>
+              <w:t>800.50</w:t>
             </w:r>
           </w:p>
         </w:tc>
@@ -26519,7 +26519,7 @@
             </w:pPr>
             <w:r/>
             <w:r>
-              <w:t>777.75</w:t>
+              <w:t>783.75</w:t>
             </w:r>
           </w:p>
         </w:tc>
@@ -26550,7 +26550,7 @@
               <w:rPr>
                 <w:b/>
               </w:rPr>
-              <w:t>784.75</w:t>
+              <w:t>790.75</w:t>
             </w:r>
           </w:p>
         </w:tc>
@@ -26698,7 +26698,7 @@
             </w:pPr>
             <w:r/>
             <w:r>
-              <w:t>784.75</w:t>
+              <w:t>790.75</w:t>
             </w:r>
           </w:p>
         </w:tc>
@@ -26726,7 +26726,7 @@
             </w:pPr>
             <w:r/>
             <w:r>
-              <w:t>799.00</w:t>
+              <w:t>805.00</w:t>
             </w:r>
           </w:p>
         </w:tc>
@@ -26754,7 +26754,7 @@
             </w:pPr>
             <w:r/>
             <w:r>
-              <w:t>770.00</w:t>
+              <w:t>776.00</w:t>
             </w:r>
           </w:p>
         </w:tc>
@@ -26785,7 +26785,7 @@
               <w:rPr>
                 <w:b/>
               </w:rPr>
-              <w:t>786.75</w:t>
+              <w:t>792.75</w:t>
             </w:r>
           </w:p>
         </w:tc>
@@ -26933,7 +26933,7 @@
             </w:pPr>
             <w:r/>
             <w:r>
-              <w:t>786.75</w:t>
+              <w:t>792.75</w:t>
             </w:r>
           </w:p>
         </w:tc>
@@ -26961,7 +26961,7 @@
             </w:pPr>
             <w:r/>
             <w:r>
-              <w:t>793.25</w:t>
+              <w:t>799.25</w:t>
             </w:r>
           </w:p>
         </w:tc>
@@ -26989,7 +26989,7 @@
             </w:pPr>
             <w:r/>
             <w:r>
-              <w:t>780.00</w:t>
+              <w:t>786.00</w:t>
             </w:r>
           </w:p>
         </w:tc>
@@ -27020,7 +27020,7 @@
               <w:rPr>
                 <w:b/>
               </w:rPr>
-              <w:t>787.00</w:t>
+              <w:t>793.00</w:t>
             </w:r>
           </w:p>
         </w:tc>
@@ -27168,7 +27168,7 @@
             </w:pPr>
             <w:r/>
             <w:r>
-              <w:t>787.00</w:t>
+              <w:t>793.00</w:t>
             </w:r>
           </w:p>
         </w:tc>
@@ -27196,7 +27196,7 @@
             </w:pPr>
             <w:r/>
             <w:r>
-              <w:t>797.25</w:t>
+              <w:t>803.25</w:t>
             </w:r>
           </w:p>
         </w:tc>
@@ -27224,7 +27224,7 @@
             </w:pPr>
             <w:r/>
             <w:r>
-              <w:t>779.00</w:t>
+              <w:t>785.00</w:t>
             </w:r>
           </w:p>
         </w:tc>
@@ -27255,7 +27255,7 @@
               <w:rPr>
                 <w:b/>
               </w:rPr>
-              <w:t>787.50</w:t>
+              <w:t>793.50</w:t>
             </w:r>
           </w:p>
         </w:tc>
@@ -27403,7 +27403,7 @@
             </w:pPr>
             <w:r/>
             <w:r>
-              <w:t>787.50</w:t>
+              <w:t>793.50</w:t>
             </w:r>
           </w:p>
         </w:tc>
@@ -27431,7 +27431,7 @@
             </w:pPr>
             <w:r/>
             <w:r>
-              <w:t>794.50</w:t>
+              <w:t>800.50</w:t>
             </w:r>
           </w:p>
         </w:tc>
@@ -27459,7 +27459,7 @@
             </w:pPr>
             <w:r/>
             <w:r>
-              <w:t>781.50</w:t>
+              <w:t>787.50</w:t>
             </w:r>
           </w:p>
         </w:tc>
@@ -27490,7 +27490,7 @@
               <w:rPr>
                 <w:b/>
               </w:rPr>
-              <w:t>786.75</w:t>
+              <w:t>792.75</w:t>
             </w:r>
           </w:p>
         </w:tc>
@@ -27638,7 +27638,7 @@
             </w:pPr>
             <w:r/>
             <w:r>
-              <w:t>786.75</w:t>
+              <w:t>792.75</w:t>
             </w:r>
           </w:p>
         </w:tc>
@@ -27666,7 +27666,7 @@
             </w:pPr>
             <w:r/>
             <w:r>
-              <w:t>800.25</w:t>
+              <w:t>806.25</w:t>
             </w:r>
           </w:p>
         </w:tc>
@@ -27694,7 +27694,7 @@
             </w:pPr>
             <w:r/>
             <w:r>
-              <w:t>773.75</w:t>
+              <w:t>779.75</w:t>
             </w:r>
           </w:p>
         </w:tc>
@@ -27725,7 +27725,7 @@
               <w:rPr>
                 <w:b/>
               </w:rPr>
-              <w:t>788.50</w:t>
+              <w:t>794.50</w:t>
             </w:r>
           </w:p>
         </w:tc>
@@ -27873,7 +27873,7 @@
             </w:pPr>
             <w:r/>
             <w:r>
-              <w:t>788.50</w:t>
+              <w:t>794.50</w:t>
             </w:r>
           </w:p>
         </w:tc>
@@ -27901,7 +27901,7 @@
             </w:pPr>
             <w:r/>
             <w:r>
-              <w:t>797.75</w:t>
+              <w:t>803.75</w:t>
             </w:r>
           </w:p>
         </w:tc>
@@ -27929,7 +27929,7 @@
             </w:pPr>
             <w:r/>
             <w:r>
-              <w:t>777.75</w:t>
+              <w:t>783.75</w:t>
             </w:r>
           </w:p>
         </w:tc>
@@ -27960,7 +27960,7 @@
               <w:rPr>
                 <w:b/>
               </w:rPr>
-              <w:t>789.00</w:t>
+              <w:t>795.00</w:t>
             </w:r>
           </w:p>
         </w:tc>
@@ -28108,7 +28108,7 @@
             </w:pPr>
             <w:r/>
             <w:r>
-              <w:t>789.00</w:t>
+              <w:t>795.00</w:t>
             </w:r>
           </w:p>
         </w:tc>
@@ -28136,7 +28136,7 @@
             </w:pPr>
             <w:r/>
             <w:r>
-              <w:t>801.25</w:t>
+              <w:t>807.25</w:t>
             </w:r>
           </w:p>
         </w:tc>
@@ -28164,7 +28164,7 @@
             </w:pPr>
             <w:r/>
             <w:r>
-              <w:t>774.75</w:t>
+              <w:t>780.75</w:t>
             </w:r>
           </w:p>
         </w:tc>
@@ -28195,7 +28195,7 @@
               <w:rPr>
                 <w:b/>
               </w:rPr>
-              <w:t>787.50</w:t>
+              <w:t>793.50</w:t>
             </w:r>
           </w:p>
         </w:tc>
@@ -28343,7 +28343,7 @@
             </w:pPr>
             <w:r/>
             <w:r>
-              <w:t>787.50</w:t>
+              <w:t>793.50</w:t>
             </w:r>
           </w:p>
         </w:tc>
@@ -28371,7 +28371,7 @@
             </w:pPr>
             <w:r/>
             <w:r>
-              <w:t>794.50</w:t>
+              <w:t>800.50</w:t>
             </w:r>
           </w:p>
         </w:tc>
@@ -28399,7 +28399,7 @@
             </w:pPr>
             <w:r/>
             <w:r>
-              <w:t>778.00</w:t>
+              <w:t>784.00</w:t>
             </w:r>
           </w:p>
         </w:tc>
@@ -28430,7 +28430,7 @@
               <w:rPr>
                 <w:b/>
               </w:rPr>
-              <w:t>788.00</w:t>
+              <w:t>794.00</w:t>
             </w:r>
           </w:p>
         </w:tc>
@@ -28578,7 +28578,7 @@
             </w:pPr>
             <w:r/>
             <w:r>
-              <w:t>788.00</w:t>
+              <w:t>794.00</w:t>
             </w:r>
           </w:p>
         </w:tc>
@@ -28606,7 +28606,7 @@
             </w:pPr>
             <w:r/>
             <w:r>
-              <w:t>798.50</w:t>
+              <w:t>804.50</w:t>
             </w:r>
           </w:p>
         </w:tc>
@@ -28634,7 +28634,7 @@
             </w:pPr>
             <w:r/>
             <w:r>
-              <w:t>780.75</w:t>
+              <w:t>786.75</w:t>
             </w:r>
           </w:p>
         </w:tc>
@@ -28665,7 +28665,7 @@
               <w:rPr>
                 <w:b/>
               </w:rPr>
-              <w:t>787.75</w:t>
+              <w:t>793.75</w:t>
             </w:r>
           </w:p>
         </w:tc>
@@ -28813,7 +28813,7 @@
             </w:pPr>
             <w:r/>
             <w:r>
-              <w:t>787.75</w:t>
+              <w:t>793.75</w:t>
             </w:r>
           </w:p>
         </w:tc>
@@ -28841,7 +28841,7 @@
             </w:pPr>
             <w:r/>
             <w:r>
-              <w:t>797.50</w:t>
+              <w:t>803.50</w:t>
             </w:r>
           </w:p>
         </w:tc>
@@ -28869,7 +28869,7 @@
             </w:pPr>
             <w:r/>
             <w:r>
-              <w:t>778.00</w:t>
+              <w:t>784.00</w:t>
             </w:r>
           </w:p>
         </w:tc>
@@ -28900,7 +28900,7 @@
               <w:rPr>
                 <w:b/>
               </w:rPr>
-              <w:t>788.25</w:t>
+              <w:t>794.25</w:t>
             </w:r>
           </w:p>
         </w:tc>
@@ -29048,7 +29048,7 @@
             </w:pPr>
             <w:r/>
             <w:r>
-              <w:t>788.25</w:t>
+              <w:t>794.25</w:t>
             </w:r>
           </w:p>
         </w:tc>
@@ -29076,7 +29076,7 @@
             </w:pPr>
             <w:r/>
             <w:r>
-              <w:t>799.00</w:t>
+              <w:t>805.00</w:t>
             </w:r>
           </w:p>
         </w:tc>
@@ -29104,7 +29104,7 @@
             </w:pPr>
             <w:r/>
             <w:r>
-              <w:t>781.00</w:t>
+              <w:t>787.00</w:t>
             </w:r>
           </w:p>
         </w:tc>
@@ -29135,7 +29135,7 @@
               <w:rPr>
                 <w:b/>
               </w:rPr>
-              <w:t>789.00</w:t>
+              <w:t>795.00</w:t>
             </w:r>
           </w:p>
         </w:tc>
@@ -29283,7 +29283,7 @@
             </w:pPr>
             <w:r/>
             <w:r>
-              <w:t>789.00</w:t>
+              <w:t>795.00</w:t>
             </w:r>
           </w:p>
         </w:tc>
@@ -29311,7 +29311,7 @@
             </w:pPr>
             <w:r/>
             <w:r>
-              <w:t>795.50</w:t>
+              <w:t>801.50</w:t>
             </w:r>
           </w:p>
         </w:tc>
@@ -29339,7 +29339,7 @@
             </w:pPr>
             <w:r/>
             <w:r>
-              <w:t>780.50</w:t>
+              <w:t>786.50</w:t>
             </w:r>
           </w:p>
         </w:tc>
@@ -29370,7 +29370,7 @@
               <w:rPr>
                 <w:b/>
               </w:rPr>
-              <w:t>789.50</w:t>
+              <w:t>795.50</w:t>
             </w:r>
           </w:p>
         </w:tc>
@@ -29518,7 +29518,7 @@
             </w:pPr>
             <w:r/>
             <w:r>
-              <w:t>789.50</w:t>
+              <w:t>795.50</w:t>
             </w:r>
           </w:p>
         </w:tc>
@@ -29546,7 +29546,7 @@
             </w:pPr>
             <w:r/>
             <w:r>
-              <w:t>800.50</w:t>
+              <w:t>806.50</w:t>
             </w:r>
           </w:p>
         </w:tc>
@@ -29574,7 +29574,7 @@
             </w:pPr>
             <w:r/>
             <w:r>
-              <w:t>777.75</w:t>
+              <w:t>783.75</w:t>
             </w:r>
           </w:p>
         </w:tc>
@@ -29605,7 +29605,7 @@
               <w:rPr>
                 <w:b/>
               </w:rPr>
-              <w:t>793.00</w:t>
+              <w:t>799.00</w:t>
             </w:r>
           </w:p>
         </w:tc>
@@ -29753,7 +29753,7 @@
             </w:pPr>
             <w:r/>
             <w:r>
-              <w:t>793.00</w:t>
+              <w:t>799.00</w:t>
             </w:r>
           </w:p>
         </w:tc>
@@ -29781,7 +29781,7 @@
             </w:pPr>
             <w:r/>
             <w:r>
-              <w:t>798.50</w:t>
+              <w:t>804.50</w:t>
             </w:r>
           </w:p>
         </w:tc>
@@ -29809,7 +29809,7 @@
             </w:pPr>
             <w:r/>
             <w:r>
-              <w:t>785.25</w:t>
+              <w:t>791.25</w:t>
             </w:r>
           </w:p>
         </w:tc>
@@ -29840,7 +29840,7 @@
               <w:rPr>
                 <w:b/>
               </w:rPr>
-              <w:t>793.75</w:t>
+              <w:t>799.75</w:t>
             </w:r>
           </w:p>
         </w:tc>
@@ -29988,7 +29988,7 @@
             </w:pPr>
             <w:r/>
             <w:r>
-              <w:t>793.75</w:t>
+              <w:t>799.75</w:t>
             </w:r>
           </w:p>
         </w:tc>
@@ -30016,7 +30016,7 @@
             </w:pPr>
             <w:r/>
             <w:r>
-              <w:t>803.00</w:t>
+              <w:t>809.00</w:t>
             </w:r>
           </w:p>
         </w:tc>
@@ -30044,7 +30044,7 @@
             </w:pPr>
             <w:r/>
             <w:r>
-              <w:t>787.25</w:t>
+              <w:t>793.25</w:t>
             </w:r>
           </w:p>
         </w:tc>
@@ -30075,7 +30075,7 @@
               <w:rPr>
                 <w:b/>
               </w:rPr>
-              <w:t>793.00</w:t>
+              <w:t>799.00</w:t>
             </w:r>
           </w:p>
         </w:tc>
@@ -30223,7 +30223,7 @@
             </w:pPr>
             <w:r/>
             <w:r>
-              <w:t>793.00</w:t>
+              <w:t>799.00</w:t>
             </w:r>
           </w:p>
         </w:tc>
@@ -30251,7 +30251,7 @@
             </w:pPr>
             <w:r/>
             <w:r>
-              <w:t>800.50</w:t>
+              <w:t>806.50</w:t>
             </w:r>
           </w:p>
         </w:tc>
@@ -30279,7 +30279,7 @@
             </w:pPr>
             <w:r/>
             <w:r>
-              <w:t>787.00</w:t>
+              <w:t>793.00</w:t>
             </w:r>
           </w:p>
         </w:tc>
@@ -30310,7 +30310,7 @@
               <w:rPr>
                 <w:b/>
               </w:rPr>
-              <w:t>792.00</w:t>
+              <w:t>798.00</w:t>
             </w:r>
           </w:p>
         </w:tc>
@@ -30458,7 +30458,7 @@
             </w:pPr>
             <w:r/>
             <w:r>
-              <w:t>792.00</w:t>
+              <w:t>798.00</w:t>
             </w:r>
           </w:p>
         </w:tc>
@@ -30486,7 +30486,7 @@
             </w:pPr>
             <w:r/>
             <w:r>
-              <w:t>799.00</w:t>
+              <w:t>805.00</w:t>
             </w:r>
           </w:p>
         </w:tc>
@@ -30514,7 +30514,7 @@
             </w:pPr>
             <w:r/>
             <w:r>
-              <w:t>778.50</w:t>
+              <w:t>784.50</w:t>
             </w:r>
           </w:p>
         </w:tc>
@@ -30545,7 +30545,7 @@
               <w:rPr>
                 <w:b/>
               </w:rPr>
-              <w:t>792.75</w:t>
+              <w:t>798.75</w:t>
             </w:r>
           </w:p>
         </w:tc>
@@ -30693,7 +30693,7 @@
             </w:pPr>
             <w:r/>
             <w:r>
-              <w:t>792.75</w:t>
+              <w:t>798.75</w:t>
             </w:r>
           </w:p>
         </w:tc>
@@ -30721,7 +30721,7 @@
             </w:pPr>
             <w:r/>
             <w:r>
-              <w:t>802.00</w:t>
+              <w:t>808.00</w:t>
             </w:r>
           </w:p>
         </w:tc>
@@ -30749,7 +30749,7 @@
             </w:pPr>
             <w:r/>
             <w:r>
-              <w:t>785.50</w:t>
+              <w:t>791.50</w:t>
             </w:r>
           </w:p>
         </w:tc>
@@ -30780,7 +30780,7 @@
               <w:rPr>
                 <w:b/>
               </w:rPr>
-              <w:t>792.50</w:t>
+              <w:t>798.50</w:t>
             </w:r>
           </w:p>
         </w:tc>
@@ -30928,7 +30928,7 @@
             </w:pPr>
             <w:r/>
             <w:r>
-              <w:t>792.50</w:t>
+              <w:t>798.50</w:t>
             </w:r>
           </w:p>
         </w:tc>
@@ -30956,7 +30956,7 @@
             </w:pPr>
             <w:r/>
             <w:r>
-              <w:t>801.00</w:t>
+              <w:t>807.00</w:t>
             </w:r>
           </w:p>
         </w:tc>
@@ -30984,7 +30984,7 @@
             </w:pPr>
             <w:r/>
             <w:r>
-              <w:t>778.50</w:t>
+              <w:t>784.50</w:t>
             </w:r>
           </w:p>
         </w:tc>
@@ -31015,7 +31015,7 @@
               <w:rPr>
                 <w:b/>
               </w:rPr>
-              <w:t>794.25</w:t>
+              <w:t>800.25</w:t>
             </w:r>
           </w:p>
         </w:tc>
@@ -31163,7 +31163,7 @@
             </w:pPr>
             <w:r/>
             <w:r>
-              <w:t>794.25</w:t>
+              <w:t>800.25</w:t>
             </w:r>
           </w:p>
         </w:tc>
@@ -31191,7 +31191,7 @@
             </w:pPr>
             <w:r/>
             <w:r>
-              <w:t>800.50</w:t>
+              <w:t>806.50</w:t>
             </w:r>
           </w:p>
         </w:tc>
@@ -31219,7 +31219,7 @@
             </w:pPr>
             <w:r/>
             <w:r>
-              <w:t>787.75</w:t>
+              <w:t>793.75</w:t>
             </w:r>
           </w:p>
         </w:tc>
@@ -31250,7 +31250,7 @@
               <w:rPr>
                 <w:b/>
               </w:rPr>
-              <w:t>793.50</w:t>
+              <w:t>799.50</w:t>
             </w:r>
           </w:p>
         </w:tc>

</xml_diff>